<commit_message>
Update hike-plan: Refugio Poqueira dicht — bivakhut La Caldera en Postero Alto als alternatieven
https://claude.ai/code/session_013vtxQxvcoD3zUXmjsxU5ik
</commit_message>
<xml_diff>
--- a/Hike-Malaga-met-Joanne-eind-september.docx
+++ b/Hike-Malaga-met-Joanne-eind-september.docx
@@ -57,12 +57,20 @@
     <w:p>
       <w:r>
         <w:rPr>
+          <w:i/>
+        </w:rPr>
+        <w:t>Let op: de bekende berghut Refugio Poqueira is wegens een grootschalige renovatie gesloten en er is geen heropeningsdatum bekend. Dit plan is daarop aangepast.</w:t>
+      </w:r>
+    </w:p>
+    <w:p>
+      <w:r>
+        <w:rPr>
           <w:b/>
         </w:rPr>
-        <w:t xml:space="preserve">Topadvies: </w:t>
+        <w:t xml:space="preserve">Topadvies (avontuurlijk): </w:t>
       </w:r>
       <w:r>
-        <w:t>rijd op vrijdagmiddag in ±2u15 van Málaga naar het witte bergdorp Capileira (1.436 m) in de Alpujarras, aan de zuidkant van de Sierra Nevada. Zaterdag wandel je omhoog naar de bewaakte berghut Refugio Poqueira op 2.500 meter, waar je eet en slaapt boven de wolken. Zondag sta je vóór zonsopkomst op en beklim je de Mulhacén (3.479 m) — de hoogste berg van het Spaanse vasteland. Zonsopkomst op het dak van Spanje, met op heldere dagen zicht tot aan de Middellandse Zee en het Rifgebergte in Marokko. Daarna daal je af en rijd je terug naar Málaga.</w:t>
+        <w:t>rijd op vrijdagmiddag in ±2u15 van Málaga naar het witte bergdorp Capileira (1.436 m) in de Alpujarras, aan de zuidkant van de Sierra Nevada. Zaterdag brengt de shuttlebus van het nationaal park je naar 2.700 m, vanwaar je in een paar uur naar de onbemande bivakhut La Caldera (3.050 m) wandelt — een stenen schuilhut aan een gletsjermeertje pal onder de Mulhacén. Zonsondergang boven de wolken, koken op een brandertje, en een sterrenhemel zoals je die zelden ziet. Zondag sta je vóór zonsopkomst op de Mulhacén (3.479 m) — de hoogste berg van het Spaanse vasteland, met op heldere dagen zicht tot aan de Middellandse Zee en het Rifgebergte in Marokko. Daarna daal je af naar Capileira en rijd je terug naar Málaga.</w:t>
       </w:r>
     </w:p>
     <w:p>
@@ -73,7 +81,18 @@
         <w:t xml:space="preserve">Waarom dit heel bijzonder is: </w:t>
       </w:r>
       <w:r>
-        <w:t>een overnachting in een echte hooggebergtehut is op zichzelf al een belevenis (warm eten, houtkachel, sterrenhemel zonder lichtvervuiling), en samen de hoogste top van vasteland-Spanje halen is een verhaal dat jullie nooit meer vergeten. Eind september is hiervoor een uitstekende periode: de zomerhitte is voorbij, de hut is open en sneeuw is meestal nog geen probleem.</w:t>
+        <w:t>een nacht op 3.000 meter in een bivakhut aan een bergmeer is puur avontuur — gratis, niet te reserveren, alleen voor wie het echt wil. Samen de hoogste top van vasteland-Spanje halen bij zonsopkomst is een verhaal dat jullie nooit meer vergeten. Eind september is hiervoor een uitstekende periode: de zomerhitte is voorbij en sneeuw is meestal nog geen probleem. Voorwaarde: warme slaapzakken, matjes en eten meenemen.</w:t>
+      </w:r>
+    </w:p>
+    <w:p>
+      <w:r>
+        <w:rPr>
+          <w:b/>
+        </w:rPr>
+        <w:t xml:space="preserve">Comfort-variant: </w:t>
+      </w:r>
+      <w:r>
+        <w:t>liever een bed, een warme douche en een gekookte maaltijd? De bemande berghut Refugio Postero Alto (1.880 m, 62 bedden) aan de noordkant van de Sierra Nevada is recent na renovatie heropend en wél gewoon te reserveren. Vanaf daar beklim je zondag de Picón de Jérez (3.088 m) — jullie eerste drieduizender, zonder bivak-gedoe.</w:t>
       </w:r>
     </w:p>
     <w:p>
@@ -92,7 +111,15 @@
         <w:pStyle w:val="Heading1"/>
       </w:pPr>
       <w:r>
-        <w:t>Topkeuze: Mulhacén met overnachting in Refugio Poqueira</w:t>
+        <w:t>Topkeuze: Mulhacén met bivak-overnachting bij La Caldera</w:t>
+      </w:r>
+    </w:p>
+    <w:p>
+      <w:r>
+        <w:rPr>
+          <w:i/>
+        </w:rPr>
+        <w:t>Status Refugio Poqueira: de bewaakte hut op 2.500 m is sinds april 2023 dicht voor een grote renovatie en er is (stand juni 2026) géén heropeningsdatum bekend. Check vlak voor vertrek refugiopoqueira.com — mocht hij net heropend zijn, dan is dat meteen de mooiste comfort-upgrade van dit plan. Tot die tijd: het alternatief hieronder is minstens zo bijzonder.</w:t>
       </w:r>
     </w:p>
     <w:p>
@@ -108,7 +135,7 @@
         <w:pStyle w:val="ListBullet"/>
       </w:pPr>
       <w:r>
-        <w:t>De Mulhacén (3.479 m) is de hoogste berg van het Iberisch schiereiland — hoger dan alles in de Pyreneeën buiten de Aneto-regio en een echte 'bucket-list'-top.</w:t>
+        <w:t>De Mulhacén (3.479 m) is de hoogste berg van het Iberisch schiereiland — een echte 'bucket-list'-top, technisch eenvoudig (stevig wandelen, geen klimwerk).</w:t>
       </w:r>
     </w:p>
     <w:p>
@@ -116,7 +143,7 @@
         <w:pStyle w:val="ListBullet"/>
       </w:pPr>
       <w:r>
-        <w:t>Refugio Poqueira (2.500 m) is een bewaakte berghut met 76 bedden, warme maaltijden, douches en zelfs een bar — comfortabel genoeg om het leuk te houden, avontuurlijk genoeg om bijzonder te zijn.</w:t>
+        <w:t>Refugio-Vivac La Caldera (±3.050 m) is een onbemande stenen schuilhut voor 16 personen, prachtig gelegen tussen de Laguna de la Caldera (gletsjermeertje) en de westflank van de Mulhacén. Gratis, altijd open, geen reservering of vergunning nodig.</w:t>
       </w:r>
     </w:p>
     <w:p>
@@ -124,7 +151,7 @@
         <w:pStyle w:val="ListBullet"/>
       </w:pPr>
       <w:r>
-        <w:t>De route is technisch eenvoudig (stevig wandelen, geen klimwerk), maar de hoogte en het uitzicht maken het episch.</w:t>
+        <w:t>Slapen op 3.000 m naast een bergmeer, zonder ander licht dan de Melkweg — dit is de meest bijzondere overnachting die Zuid-Spanje te bieden heeft.</w:t>
       </w:r>
     </w:p>
     <w:p>
@@ -172,6 +199,14 @@
         <w:pStyle w:val="ListBullet"/>
       </w:pPr>
       <w:r>
+        <w:t>Shuttle voor zaterdag bevestigen bij het bezoekerscentrum (Servicio de Interpretación de Altas Cumbres) en de bergverwachting checken.</w:t>
+      </w:r>
+    </w:p>
+    <w:p>
+      <w:pPr>
+        <w:pStyle w:val="ListBullet"/>
+      </w:pPr>
+      <w:r>
         <w:t>Diner met Alpujarras-specialiteiten: plato alpujarreño, lokale jamón uit Trevélez (het hoogste ham-dorp van Spanje).</w:t>
       </w:r>
     </w:p>
@@ -180,7 +215,7 @@
         <w:pStyle w:val="Heading3"/>
       </w:pPr>
       <w:r>
-        <w:t>Zaterdag — omhoog naar de hut (de mooie lange dag)</w:t>
+        <w:t>Zaterdag — met de shuttle de hoogte in, bivak aan het meer</w:t>
       </w:r>
     </w:p>
     <w:p>
@@ -188,7 +223,7 @@
         <w:pStyle w:val="ListBullet"/>
       </w:pPr>
       <w:r>
-        <w:t>Ontbijt en op pad vanaf Capileira. De klassieke route via de Acequia-paden naar Refugio Poqueira is ±10,5 km met ±1.150 m stijging; reken op 4,5–5 uur rustig wandelen.</w:t>
+        <w:t>Ochtend: shuttlebus van het nationaal park vanuit Capileira naar het Mirador de Trevélez op ±2.700 m (reserveren!). Zo sparen jullie 1.300 hoogtemeters en blijft het genieten.</w:t>
       </w:r>
     </w:p>
     <w:p>
@@ -196,7 +231,7 @@
         <w:pStyle w:val="ListBullet"/>
       </w:pPr>
       <w:r>
-        <w:t>Lichtere optie: neem de shuttlebus van het nationaal park (Servicio de Interpretación de Altas Cumbres) vanuit Capileira tot Mirador de Trevélez op ±2.700 m en wandel licht dalend naar de hut — dan houden jullie energie over en is dit ook haalbaar zonder veel bergervaring. Reserveren in het bezoekerscentrum van Capileira / telefonisch.</w:t>
+        <w:t>Vanaf het mirador in 2,5–3,5 uur over de hoogvlakte (deels via de oude Veleta-weg) naar de bivakhut bij de Laguna de la Caldera (±3.050 m). Onderweg grote kans op berggeiten (cabra montés).</w:t>
       </w:r>
     </w:p>
     <w:p>
@@ -204,7 +239,23 @@
         <w:pStyle w:val="ListBullet"/>
       </w:pPr>
       <w:r>
-        <w:t>Middag/avond bij de hut: korte verkenning, zonsondergang boven de wolken, warme maaltijd in de hut en daarna — het hoogtepunt — een overweldigende sterrenhemel zonder enige lichtvervuiling.</w:t>
+        <w:t>Plek in de hut is niet te reserveren (vol = vol, 16 plekken): wees er vroeg in de middag. Vol? Bivakkeren naast de hut met matje en slaapzak is daar eveneens toegestaan en zo mogelijk nóg mooier.</w:t>
+      </w:r>
+    </w:p>
+    <w:p>
+      <w:pPr>
+        <w:pStyle w:val="ListBullet"/>
+      </w:pPr>
+      <w:r>
+        <w:t>Middag/avond: zonsondergang boven een wolkenzee, zelf koken op een brandertje aan het meer, en daarna het absolute hoogtepunt — een overweldigende sterrenhemel zonder enige lichtvervuiling.</w:t>
+      </w:r>
+    </w:p>
+    <w:p>
+      <w:pPr>
+        <w:pStyle w:val="ListBullet"/>
+      </w:pPr>
+      <w:r>
+        <w:t>Water: uit de lagune, altijd filteren of bijkoken (waterfilter mee). Al het afval gaat mee terug naar beneden.</w:t>
       </w:r>
     </w:p>
     <w:p>
@@ -220,7 +271,7 @@
         <w:pStyle w:val="ListBullet"/>
       </w:pPr>
       <w:r>
-        <w:t>±05:30 op met hoofdlampen: de klim van de hut naar de top van de Mulhacén is ±5 km en ±1.000 m stijging (2,5–3 uur). Zonsopkomst op 3.479 m is het magische moment van het weekend.</w:t>
+        <w:t>±06:00 op met hoofdlampen: van de hut naar de top van de Mulhacén is ±2,5 km en ±430 m stijging over de westgraat (1,5 uur). Zonsopkomst op 3.479 m is het magische moment van het weekend.</w:t>
       </w:r>
     </w:p>
     <w:p>
@@ -228,7 +279,7 @@
         <w:pStyle w:val="ListBullet"/>
       </w:pPr>
       <w:r>
-        <w:t>Terug naar de hut voor een tweede ontbijt, daarna afdalen naar Capileira (±3–4 uur).</w:t>
+        <w:t>Terug bij de hut ontbijten en inpakken, daarna in ±4–5 uur afdalen naar Capileira (of terug naar het mirador als de shuttle is geboekt voor de terugweg).</w:t>
       </w:r>
     </w:p>
     <w:p>
@@ -244,7 +295,7 @@
         <w:pStyle w:val="Heading2"/>
       </w:pPr>
       <w:r>
-        <w:t>Refugio Poqueira — reserveren (belangrijk!)</w:t>
+        <w:t>Extra nodig voor de bivaknacht</w:t>
       </w:r>
     </w:p>
     <w:p>
@@ -252,7 +303,7 @@
         <w:pStyle w:val="ListBullet"/>
       </w:pPr>
       <w:r>
-        <w:t>Reserveren kan alleen telefonisch: +34 958 343 349 (dagelijks 10:00–17:00). Online boeken kan niet; een beetje Spaans helpt. Doe dit zodra jullie data vaststaan — weekenden zijn populair.</w:t>
+        <w:t>Warme slaapzak (comforttemperatuur rond 0 °C — nachten op 3.000 m zijn koud, ook eind september) en een slaapmatje.</w:t>
       </w:r>
     </w:p>
     <w:p>
@@ -260,7 +311,7 @@
         <w:pStyle w:val="ListBullet"/>
       </w:pPr>
       <w:r>
-        <w:t>Inchecken vóór 18:00. Halfpension (diner + ontbijt) is aan te raden; er zijn dekens, maar neem een lakenzak mee.</w:t>
+        <w:t>Kooksetje + gasbrander, vrieszakmaaltijden of pasta, ontbijt en ruim snacks; 2× zoveel als je denkt nodig te hebben.</w:t>
       </w:r>
     </w:p>
     <w:p>
@@ -268,7 +319,7 @@
         <w:pStyle w:val="ListBullet"/>
       </w:pPr>
       <w:r>
-        <w:t>Website ter info: refugiopoqueira.com. Prijsindicatie: ±€20 p.p. overnachting, ±€18–20 voor het diner.</w:t>
+        <w:t>Waterfilter of -tabletten (water komt uit de lagune).</w:t>
       </w:r>
     </w:p>
     <w:p>
@@ -276,7 +327,52 @@
         <w:pStyle w:val="ListBullet"/>
       </w:pPr>
       <w:r>
-        <w:t>Geen plek in de hut? Vraag naar de onbewaakte bivakhut (Refugio Vivac La Caldera) als avontuurlijk alternatief, of maak er een lange dagtocht van met de shuttle.</w:t>
+        <w:t>De hut is basic: stenen slaapplateaus, geen verwarming, geen toilet. Dat is precies de charme — maar wees erop voorbereid.</w:t>
+      </w:r>
+    </w:p>
+    <w:p>
+      <w:pPr>
+        <w:pStyle w:val="ListBullet"/>
+      </w:pPr>
+      <w:r>
+        <w:t>Geen bivak-ervaring of liever niet sjouwen? Kies dan de comfort-variant hieronder.</w:t>
+      </w:r>
+    </w:p>
+    <w:p>
+      <w:pPr>
+        <w:pStyle w:val="Heading2"/>
+      </w:pPr>
+      <w:r>
+        <w:t>Comfort-variant: Refugio Postero Alto + Picón de Jérez</w:t>
+      </w:r>
+    </w:p>
+    <w:p>
+      <w:r>
+        <w:t>Wil je wél de bemande-berghut-ervaring (bedden, warme douche, diner aan lange tafels) nu Poqueira dicht is? Rijd dan naar de noordkant van de Sierra Nevada: Refugio Postero Alto (1.880 m, 62 bedden) bij Jérez del Marquesado is recent na renovatie heropend.</w:t>
+      </w:r>
+    </w:p>
+    <w:p>
+      <w:pPr>
+        <w:pStyle w:val="ListBullet"/>
+      </w:pPr>
+      <w:r>
+        <w:t>Rijtijd vanaf Málaga ±2u30 via Granada/Guadix. Zaterdag: wandel vanaf Jérez del Marquesado via het PR-A 31-pad naar de hut (±1u45, rustig) of loop een langere lus; de auto kan eventueel zelfs via een 12,8 km lange bospiste tot de hut.</w:t>
+      </w:r>
+    </w:p>
+    <w:p>
+      <w:pPr>
+        <w:pStyle w:val="ListBullet"/>
+      </w:pPr>
+      <w:r>
+        <w:t>Zondag: beklimming van de Picón de Jérez (3.088 m) — een stevige maar prachtige tocht door het Alhorí-dal; jullie eerste drieduizender.</w:t>
+      </w:r>
+    </w:p>
+    <w:p>
+      <w:pPr>
+        <w:pStyle w:val="ListBullet"/>
+      </w:pPr>
+      <w:r>
+        <w:t>Reserveren: telefonisch +34 622 762 265 (07:00–23:00), vooraf betalen. Info: refugiopicondejerez.com.</w:t>
       </w:r>
     </w:p>
     <w:p>
@@ -376,15 +472,16 @@
         <w:tblLook w:firstColumn="1" w:firstRow="1" w:lastColumn="0" w:lastRow="0" w:noHBand="0" w:noVBand="1" w:val="04A0"/>
       </w:tblPr>
       <w:tblGrid>
-        <w:gridCol w:w="2160"/>
-        <w:gridCol w:w="2160"/>
-        <w:gridCol w:w="2160"/>
-        <w:gridCol w:w="2160"/>
+        <w:gridCol w:w="1728"/>
+        <w:gridCol w:w="1728"/>
+        <w:gridCol w:w="1728"/>
+        <w:gridCol w:w="1728"/>
+        <w:gridCol w:w="1728"/>
       </w:tblGrid>
       <w:tr>
         <w:tc>
           <w:tcPr>
-            <w:tcW w:type="dxa" w:w="2160"/>
+            <w:tcW w:type="dxa" w:w="1728"/>
           </w:tcPr>
           <w:p>
             <w:r>
@@ -396,33 +493,46 @@
         </w:tc>
         <w:tc>
           <w:tcPr>
-            <w:tcW w:type="dxa" w:w="2160"/>
+            <w:tcW w:type="dxa" w:w="1728"/>
           </w:tcPr>
           <w:p>
             <w:r>
               <w:rPr>
                 <w:b/>
               </w:rPr>
-              <w:t>Mulhacén + Refugio Poqueira</w:t>
+              <w:t>Mulhacén + bivak La Caldera</w:t>
             </w:r>
           </w:p>
         </w:tc>
         <w:tc>
           <w:tcPr>
-            <w:tcW w:type="dxa" w:w="2160"/>
+            <w:tcW w:type="dxa" w:w="1728"/>
           </w:tcPr>
           <w:p>
             <w:r>
               <w:rPr>
                 <w:b/>
               </w:rPr>
-              <w:t>Torrecilla (Sierra de las Nieves)</w:t>
+              <w:t>Postero Alto + Picón de Jérez</w:t>
             </w:r>
           </w:p>
         </w:tc>
         <w:tc>
           <w:tcPr>
-            <w:tcW w:type="dxa" w:w="2160"/>
+            <w:tcW w:type="dxa" w:w="1728"/>
+          </w:tcPr>
+          <w:p>
+            <w:r>
+              <w:rPr>
+                <w:b/>
+              </w:rPr>
+              <w:t>Torrecilla (S. de las Nieves)</w:t>
+            </w:r>
+          </w:p>
+        </w:tc>
+        <w:tc>
+          <w:tcPr>
+            <w:tcW w:type="dxa" w:w="1728"/>
           </w:tcPr>
           <w:p>
             <w:r>
@@ -437,7 +547,7 @@
       <w:tr>
         <w:tc>
           <w:tcPr>
-            <w:tcW w:type="dxa" w:w="2160"/>
+            <w:tcW w:type="dxa" w:w="1728"/>
           </w:tcPr>
           <w:p>
             <w:r>
@@ -450,7 +560,7 @@
         </w:tc>
         <w:tc>
           <w:tcPr>
-            <w:tcW w:type="dxa" w:w="2160"/>
+            <w:tcW w:type="dxa" w:w="1728"/>
           </w:tcPr>
           <w:p>
             <w:r>
@@ -460,7 +570,17 @@
         </w:tc>
         <w:tc>
           <w:tcPr>
-            <w:tcW w:type="dxa" w:w="2160"/>
+            <w:tcW w:type="dxa" w:w="1728"/>
+          </w:tcPr>
+          <w:p>
+            <w:r>
+              <w:t>±2u30 (Jérez del M.)</w:t>
+            </w:r>
+          </w:p>
+        </w:tc>
+        <w:tc>
+          <w:tcPr>
+            <w:tcW w:type="dxa" w:w="1728"/>
           </w:tcPr>
           <w:p>
             <w:r>
@@ -470,7 +590,7 @@
         </w:tc>
         <w:tc>
           <w:tcPr>
-            <w:tcW w:type="dxa" w:w="2160"/>
+            <w:tcW w:type="dxa" w:w="1728"/>
           </w:tcPr>
           <w:p>
             <w:r>
@@ -482,7 +602,7 @@
       <w:tr>
         <w:tc>
           <w:tcPr>
-            <w:tcW w:type="dxa" w:w="2160"/>
+            <w:tcW w:type="dxa" w:w="1728"/>
           </w:tcPr>
           <w:p>
             <w:r>
@@ -495,7 +615,7 @@
         </w:tc>
         <w:tc>
           <w:tcPr>
-            <w:tcW w:type="dxa" w:w="2160"/>
+            <w:tcW w:type="dxa" w:w="1728"/>
           </w:tcPr>
           <w:p>
             <w:r>
@@ -505,7 +625,17 @@
         </w:tc>
         <w:tc>
           <w:tcPr>
-            <w:tcW w:type="dxa" w:w="2160"/>
+            <w:tcW w:type="dxa" w:w="1728"/>
+          </w:tcPr>
+          <w:p>
+            <w:r>
+              <w:t>3.088 m</w:t>
+            </w:r>
+          </w:p>
+        </w:tc>
+        <w:tc>
+          <w:tcPr>
+            <w:tcW w:type="dxa" w:w="1728"/>
           </w:tcPr>
           <w:p>
             <w:r>
@@ -515,7 +645,7 @@
         </w:tc>
         <w:tc>
           <w:tcPr>
-            <w:tcW w:type="dxa" w:w="2160"/>
+            <w:tcW w:type="dxa" w:w="1728"/>
           </w:tcPr>
           <w:p>
             <w:r>
@@ -527,7 +657,7 @@
       <w:tr>
         <w:tc>
           <w:tcPr>
-            <w:tcW w:type="dxa" w:w="2160"/>
+            <w:tcW w:type="dxa" w:w="1728"/>
           </w:tcPr>
           <w:p>
             <w:r>
@@ -540,17 +670,27 @@
         </w:tc>
         <w:tc>
           <w:tcPr>
-            <w:tcW w:type="dxa" w:w="2160"/>
+            <w:tcW w:type="dxa" w:w="1728"/>
           </w:tcPr>
           <w:p>
             <w:r>
-              <w:t>Pittig (2 dagen, hoogte)</w:t>
+              <w:t>Pittig (bivak op 3.000 m)</w:t>
             </w:r>
           </w:p>
         </w:tc>
         <w:tc>
           <w:tcPr>
-            <w:tcW w:type="dxa" w:w="2160"/>
+            <w:tcW w:type="dxa" w:w="1728"/>
+          </w:tcPr>
+          <w:p>
+            <w:r>
+              <w:t>Gemiddeld–pittig</w:t>
+            </w:r>
+          </w:p>
+        </w:tc>
+        <w:tc>
+          <w:tcPr>
+            <w:tcW w:type="dxa" w:w="1728"/>
           </w:tcPr>
           <w:p>
             <w:r>
@@ -560,7 +700,7 @@
         </w:tc>
         <w:tc>
           <w:tcPr>
-            <w:tcW w:type="dxa" w:w="2160"/>
+            <w:tcW w:type="dxa" w:w="1728"/>
           </w:tcPr>
           <w:p>
             <w:r>
@@ -572,7 +712,7 @@
       <w:tr>
         <w:tc>
           <w:tcPr>
-            <w:tcW w:type="dxa" w:w="2160"/>
+            <w:tcW w:type="dxa" w:w="1728"/>
           </w:tcPr>
           <w:p>
             <w:r>
@@ -585,17 +725,27 @@
         </w:tc>
         <w:tc>
           <w:tcPr>
-            <w:tcW w:type="dxa" w:w="2160"/>
+            <w:tcW w:type="dxa" w:w="1728"/>
           </w:tcPr>
           <w:p>
             <w:r>
-              <w:t>Berghut op 2.500 m ★</w:t>
+              <w:t>Bivakhut aan bergmeer ★</w:t>
             </w:r>
           </w:p>
         </w:tc>
         <w:tc>
           <w:tcPr>
-            <w:tcW w:type="dxa" w:w="2160"/>
+            <w:tcW w:type="dxa" w:w="1728"/>
+          </w:tcPr>
+          <w:p>
+            <w:r>
+              <w:t>Bemande berghut</w:t>
+            </w:r>
+          </w:p>
+        </w:tc>
+        <w:tc>
+          <w:tcPr>
+            <w:tcW w:type="dxa" w:w="1728"/>
           </w:tcPr>
           <w:p>
             <w:r>
@@ -605,7 +755,7 @@
         </w:tc>
         <w:tc>
           <w:tcPr>
-            <w:tcW w:type="dxa" w:w="2160"/>
+            <w:tcW w:type="dxa" w:w="1728"/>
           </w:tcPr>
           <w:p>
             <w:r>
@@ -617,7 +767,7 @@
       <w:tr>
         <w:tc>
           <w:tcPr>
-            <w:tcW w:type="dxa" w:w="2160"/>
+            <w:tcW w:type="dxa" w:w="1728"/>
           </w:tcPr>
           <w:p>
             <w:r>
@@ -630,7 +780,7 @@
         </w:tc>
         <w:tc>
           <w:tcPr>
-            <w:tcW w:type="dxa" w:w="2160"/>
+            <w:tcW w:type="dxa" w:w="1728"/>
           </w:tcPr>
           <w:p>
             <w:r>
@@ -640,7 +790,7 @@
         </w:tc>
         <w:tc>
           <w:tcPr>
-            <w:tcW w:type="dxa" w:w="2160"/>
+            <w:tcW w:type="dxa" w:w="1728"/>
           </w:tcPr>
           <w:p>
             <w:r>
@@ -650,7 +800,17 @@
         </w:tc>
         <w:tc>
           <w:tcPr>
-            <w:tcW w:type="dxa" w:w="2160"/>
+            <w:tcW w:type="dxa" w:w="1728"/>
+          </w:tcPr>
+          <w:p>
+            <w:r>
+              <w:t>★★★★</w:t>
+            </w:r>
+          </w:p>
+        </w:tc>
+        <w:tc>
+          <w:tcPr>
+            <w:tcW w:type="dxa" w:w="1728"/>
           </w:tcPr>
           <w:p>
             <w:r>
@@ -737,7 +897,7 @@
         <w:pStyle w:val="ListBullet"/>
       </w:pPr>
       <w:r>
-        <w:t>Lakenzak en oordopjes voor de hut, kleine handdoek, toilettasje</w:t>
+        <w:t>Bij de bivak-optie: warme slaapzak, matje, brander + kookset, waterfilter (zie hoofdstuk hierboven); bij Postero Alto volstaan lakenzak en oordopjes</w:t>
       </w:r>
     </w:p>
     <w:p>
@@ -817,7 +977,7 @@
         <w:pStyle w:val="ListNumber"/>
       </w:pPr>
       <w:r>
-        <w:t>2. Refugio Poqueira bellen en reserveren: +34 958 343 349 (10:00–17:00).</w:t>
+        <w:t>2. Kiezen: bivak-avontuur (La Caldera, niet te reserveren) of comfort-hut (Postero Alto bellen: +34 622 762 265).</w:t>
       </w:r>
     </w:p>
     <w:p>
@@ -833,7 +993,7 @@
         <w:pStyle w:val="ListNumber"/>
       </w:pPr>
       <w:r>
-        <w:t>4. Eventueel shuttle (Altas Cumbres) reserveren voor de zaterdag.</w:t>
+        <w:t>4. Shuttle Altas Cumbres reserveren voor de zaterdag (bezoekerscentrum Capileira).</w:t>
       </w:r>
     </w:p>
     <w:p>
@@ -841,7 +1001,7 @@
         <w:pStyle w:val="ListNumber"/>
       </w:pPr>
       <w:r>
-        <w:t>5. Huurauto-periode checken (mag de auto de bergwegen op? vrijwel altijd ja).</w:t>
+        <w:t>5. Slaapzakken/matjes/brandertje regelen — meenemen uit Nederland of huren/kopen in Málaga (bijv. Decathlon).</w:t>
       </w:r>
     </w:p>
     <w:p>
@@ -849,7 +1009,15 @@
         <w:pStyle w:val="ListNumber"/>
       </w:pPr>
       <w:r>
-        <w:t>6. Week vooraf: weersverwachting checken en paklijst klaarleggen.</w:t>
+        <w:t>6. Vlak voor vertrek: check refugiopoqueira.com — bij heropening is dát de mooiste optie.</w:t>
+      </w:r>
+    </w:p>
+    <w:p>
+      <w:pPr>
+        <w:pStyle w:val="ListNumber"/>
+      </w:pPr>
+      <w:r>
+        <w:t>7. Week vooraf: weersverwachting checken en paklijst klaarleggen.</w:t>
       </w:r>
     </w:p>
     <w:p>
@@ -865,7 +1033,7 @@
         <w:pStyle w:val="ListBullet"/>
       </w:pPr>
       <w:r>
-        <w:t>Refugio Poqueira (hut, info en telefoonnummer): refugiopoqueira.com</w:t>
+        <w:t>Bivakhut La Caldera (officiële info nationaal park): juntadeandalucia.es → Ventana del Visitante → 'La Caldera'</w:t>
       </w:r>
     </w:p>
     <w:p>
@@ -873,7 +1041,7 @@
         <w:pStyle w:val="ListBullet"/>
       </w:pPr>
       <w:r>
-        <w:t>Route Mulhacén via Refugio Poqueira: alltrails.com (zoek 'Mulhacén via Refugio Poqueira')</w:t>
+        <w:t>Refugio Postero Alto / Picón de Jérez (reserveren): refugiopicondejerez.com · +34 622 762 265</w:t>
       </w:r>
     </w:p>
     <w:p>
@@ -881,7 +1049,23 @@
         <w:pStyle w:val="ListBullet"/>
       </w:pPr>
       <w:r>
-        <w:t>Spanish Highs — uitleg hut &amp; routes Sierra Nevada: spanishhighs.com/poqueira-refugio-hut-sierra-nevada.html</w:t>
+        <w:t>Status Refugio Poqueira (check vóór vertrek): refugiopoqueira.com</w:t>
+      </w:r>
+    </w:p>
+    <w:p>
+      <w:pPr>
+        <w:pStyle w:val="ListBullet"/>
+      </w:pPr>
+      <w:r>
+        <w:t>Route Mulhacén: alltrails.com (zoek 'Mulhacén via Mirador de Trevélez' of 'via Refugio Poqueira')</w:t>
+      </w:r>
+    </w:p>
+    <w:p>
+      <w:pPr>
+        <w:pStyle w:val="ListBullet"/>
+      </w:pPr>
+      <w:r>
+        <w:t>Overzicht hutten &amp; bivaks Sierra Nevada: andaltura.com (refugios de Sierra Nevada)</w:t>
       </w:r>
     </w:p>
     <w:p>

</xml_diff>

<commit_message>
Herwerk hike-plan: avontuurlijke Mulhacén-topdag met chill basecamp (jacuzzi) in Capileira
https://claude.ai/code/session_013vtxQxvcoD3zUXmjsxU5ik
</commit_message>
<xml_diff>
--- a/Hike-Malaga-met-Joanne-eind-september.docx
+++ b/Hike-Malaga-met-Joanne-eind-september.docx
@@ -38,7 +38,7 @@
           <w:color w:val="555555"/>
           <w:sz w:val="24"/>
         </w:rPr>
-        <w:t>Met de huurauto de hoogte in — inclusief overnachting op 2.500 meter</w:t>
+        <w:t>Avontuurlijk de hoogte in, chill weer naar beneden — topdag op 3.479 m, jacuzzi in de avond</w:t>
       </w:r>
     </w:p>
     <w:p>
@@ -67,10 +67,10 @@
         <w:rPr>
           <w:b/>
         </w:rPr>
-        <w:t xml:space="preserve">Topadvies (avontuurlijk): </w:t>
+        <w:t xml:space="preserve">Topadvies — avontuurlijk overdag, chill 's avonds: </w:t>
       </w:r>
       <w:r>
-        <w:t>rijd op vrijdagmiddag in ±2u15 van Málaga naar het witte bergdorp Capileira (1.436 m) in de Alpujarras, aan de zuidkant van de Sierra Nevada. Zaterdag brengt de shuttlebus van het nationaal park je naar 2.700 m, vanwaar je in een paar uur naar de onbemande bivakhut La Caldera (3.050 m) wandelt — een stenen schuilhut aan een gletsjermeertje pal onder de Mulhacén. Zonsondergang boven de wolken, koken op een brandertje, en een sterrenhemel zoals je die zelden ziet. Zondag sta je vóór zonsopkomst op de Mulhacén (3.479 m) — de hoogste berg van het Spaanse vasteland, met op heldere dagen zicht tot aan de Middellandse Zee en het Rifgebergte in Marokko. Daarna daal je af naar Capileira en rijd je terug naar Málaga.</w:t>
+        <w:t>rijd op vrijdagmiddag in ±2u15 van Málaga naar het witte bergdorp Capileira (1.436 m) in de Alpujarras, aan de zuidkant van de Sierra Nevada, en boek daar twee nachten in een casa rural met privé-jacuzzi of zwembad en uitzicht over de Poqueira-kloof. Zaterdag is de grote dag: de shuttlebus van het nationaal park brengt jullie naar 2.700 m, vanwaar je met een lichte rugzak in 2,5–3 uur naar de top van de Mulhacén (3.479 m) wandelt — de hoogste berg van het Spaanse vasteland, met op heldere dagen zicht tot aan de Middellandse Zee en het Rifgebergte in Marokko. Eind van de middag terug met de shuttle, en dan het chill-gedeelte: bubbelen in de jacuzzi met een glas wijn, gevolgd door een lang diner met Alpujarras-specialiteiten. Zondag rustig ontbijten, een kort kloofwandelingetje of het ham-dorp Trevélez, en relaxed terugrijden naar Málaga.</w:t>
       </w:r>
     </w:p>
     <w:p>
@@ -81,7 +81,7 @@
         <w:t xml:space="preserve">Waarom dit heel bijzonder is: </w:t>
       </w:r>
       <w:r>
-        <w:t>een nacht op 3.000 meter in een bivakhut aan een bergmeer is puur avontuur — gratis, niet te reserveren, alleen voor wie het echt wil. Samen de hoogste top van vasteland-Spanje halen bij zonsopkomst is een verhaal dat jullie nooit meer vergeten. Eind september is hiervoor een uitstekende periode: de zomerhitte is voorbij en sneeuw is meestal nog geen probleem. Voorwaarde: warme slaapzakken, matjes en eten meenemen.</w:t>
+        <w:t>jullie halen samen de hoogste top van vasteland-Spanje — een écht avontuur op grote hoogte — maar zonder zware rugzakken, koude nachten of bivak-gedoe, en met elke avond comfort, goed eten en een sterrenhemel vanuit de jacuzzi. Eind september is de ideale periode: de zomerhitte is voorbij, de shuttle rijdt nog en sneeuw is meestal nog geen probleem.</w:t>
       </w:r>
     </w:p>
     <w:p>
@@ -89,10 +89,10 @@
         <w:rPr>
           <w:b/>
         </w:rPr>
-        <w:t xml:space="preserve">Comfort-variant: </w:t>
+        <w:t xml:space="preserve">Upgrade voor meer avontuur: </w:t>
       </w:r>
       <w:r>
-        <w:t>liever een bed, een warme douche en een gekookte maaltijd? De bemande berghut Refugio Postero Alto (1.880 m, 62 bedden) aan de noordkant van de Sierra Nevada is recent na renovatie heropend en wél gewoon te reserveren. Vanaf daar beklim je zondag de Picón de Jérez (3.088 m) — jullie eerste drieduizender, zonder bivak-gedoe.</w:t>
+        <w:t>wil je er tóch een nacht op de berg bij? Sla dan een hotelnacht over en slaap in de onbemande bivakhut La Caldera (3.050 m) aan een gletsjermeertje onder de top — spectaculair, maar basic (slaapzak, matje en eten mee). Verderop uitgewerkt.</w:t>
       </w:r>
     </w:p>
     <w:p>
@@ -111,7 +111,7 @@
         <w:pStyle w:val="Heading1"/>
       </w:pPr>
       <w:r>
-        <w:t>Topkeuze: Mulhacén met bivak-overnachting bij La Caldera</w:t>
+        <w:t>Topkeuze: Mulhacén-topdag vanuit chill basecamp Capileira</w:t>
       </w:r>
     </w:p>
     <w:p>
@@ -143,7 +143,7 @@
         <w:pStyle w:val="ListBullet"/>
       </w:pPr>
       <w:r>
-        <w:t>Refugio-Vivac La Caldera (±3.050 m) is een onbemande stenen schuilhut voor 16 personen, prachtig gelegen tussen de Laguna de la Caldera (gletsjermeertje) en de westflank van de Mulhacén. Gratis, altijd open, geen reservering of vergunning nodig.</w:t>
+        <w:t>Dankzij de parkshuttle naar 2.700 m wordt de topdag een prachtig maar goed haalbaar avontuur met lichte rugzak: ±14 km heen en terug over de hoogvlakte, ±800 m stijging, met grote kans op steenbokken (cabra montés) onderweg.</w:t>
       </w:r>
     </w:p>
     <w:p>
@@ -151,7 +151,7 @@
         <w:pStyle w:val="ListBullet"/>
       </w:pPr>
       <w:r>
-        <w:t>Slapen op 3.000 m naast een bergmeer, zonder ander licht dan de Melkweg — dit is de meest bijzondere overnachting die Zuid-Spanje te bieden heeft.</w:t>
+        <w:t>Twee nachten hetzelfde fijne adres: niet sjouwen met bagage, na de top direct de jacuzzi of het zwembad in, lang tafelen en uitslapen.</w:t>
       </w:r>
     </w:p>
     <w:p>
@@ -175,7 +175,7 @@
         <w:pStyle w:val="Heading3"/>
       </w:pPr>
       <w:r>
-        <w:t>Vrijdag — aankomst in de Alpujarras</w:t>
+        <w:t>Vrijdag — aankomst in de Alpujarras, jacuzzi-avond</w:t>
       </w:r>
     </w:p>
     <w:p>
@@ -191,7 +191,7 @@
         <w:pStyle w:val="ListBullet"/>
       </w:pPr>
       <w:r>
-        <w:t>Overnachting in Capileira (1.436 m) in een klein hotel of casa rural — bijv. een kamer met uitzicht over de Poqueira-kloof. Capileira is een van de mooiste witte dorpen van Andalusië.</w:t>
+        <w:t>Inchecken in jullie casa rural of boutique-hotel in/rond Capileira (1.436 m) — zie 'Bijzonder slapen' hieronder. Eerste avond meteen chill: terras, jacuzzi, uitzicht over de kloof.</w:t>
       </w:r>
     </w:p>
     <w:p>
@@ -215,7 +215,7 @@
         <w:pStyle w:val="Heading3"/>
       </w:pPr>
       <w:r>
-        <w:t>Zaterdag — met de shuttle de hoogte in, bivak aan het meer</w:t>
+        <w:t>Zaterdag — de topdag: Mulhacén (3.479 m)</w:t>
       </w:r>
     </w:p>
     <w:p>
@@ -223,7 +223,7 @@
         <w:pStyle w:val="ListBullet"/>
       </w:pPr>
       <w:r>
-        <w:t>Ochtend: shuttlebus van het nationaal park vanuit Capileira naar het Mirador de Trevélez op ±2.700 m (reserveren!). Zo sparen jullie 1.300 hoogtemeters en blijft het genieten.</w:t>
+        <w:t>±08:30 shuttlebus van het nationaal park vanuit Capileira naar het Mirador de Trevélez op ±2.700 m (vooraf reserveren!). Zo sparen jullie 1.300 hoogtemeters en blijft het de hele dag genieten.</w:t>
       </w:r>
     </w:p>
     <w:p>
@@ -231,7 +231,7 @@
         <w:pStyle w:val="ListBullet"/>
       </w:pPr>
       <w:r>
-        <w:t>Vanaf het mirador in 2,5–3,5 uur over de hoogvlakte (deels via de oude Veleta-weg) naar de bivakhut bij de Laguna de la Caldera (±3.050 m). Onderweg grote kans op berggeiten (cabra montés).</w:t>
+        <w:t>Vanaf het mirador in 2,5–3 uur naar de top: een weids, geleidelijk pad over de hoogvlakte met steeds groter uitzicht. Picknicklunch op het dak van Spanje, met op heldere dagen zicht op zee én Marokko.</w:t>
       </w:r>
     </w:p>
     <w:p>
@@ -239,7 +239,7 @@
         <w:pStyle w:val="ListBullet"/>
       </w:pPr>
       <w:r>
-        <w:t>Plek in de hut is niet te reserveren (vol = vol, 16 plekken): wees er vroeg in de middag. Vol? Bivakkeren naast de hut met matje en slaapzak is daar eveneens toegestaan en zo mogelijk nóg mooier.</w:t>
+        <w:t>Rustig terug naar het mirador (totaal ±14 km, ±800 m stijging) en met de middagshuttle (±17:00) naar Capileira. Lichte dagrugzak volstaat: water, lunch, warme laag, zonnebrand.</w:t>
       </w:r>
     </w:p>
     <w:p>
@@ -247,7 +247,15 @@
         <w:pStyle w:val="ListBullet"/>
       </w:pPr>
       <w:r>
-        <w:t>Middag/avond: zonsondergang boven een wolkenzee, zelf koken op een brandertje aan het meer, en daarna het absolute hoogtepunt — een overweldigende sterrenhemel zonder enige lichtvervuiling.</w:t>
+        <w:t>En dan het chill-gedeelte: jacuzzi of zwembad met een glas cava, siësta, en 's avonds lang tafelen. Spierpijn was nog nooit zo aangenaam.</w:t>
+      </w:r>
+    </w:p>
+    <w:p>
+      <w:pPr>
+        <w:pStyle w:val="Heading3"/>
+      </w:pPr>
+      <w:r>
+        <w:t>Zondag — uitslapen, kloof en relaxed terug</w:t>
       </w:r>
     </w:p>
     <w:p>
@@ -255,15 +263,7 @@
         <w:pStyle w:val="ListBullet"/>
       </w:pPr>
       <w:r>
-        <w:t>Water: uit de lagune, altijd filteren of bijkoken (waterfilter mee). Al het afval gaat mee terug naar beneden.</w:t>
-      </w:r>
-    </w:p>
-    <w:p>
-      <w:pPr>
-        <w:pStyle w:val="Heading3"/>
-      </w:pPr>
-      <w:r>
-        <w:t>Zondag — zonsopkomst op het dak van Spanje</w:t>
+        <w:t>Uitslapen en lang ontbijten op het terras.</w:t>
       </w:r>
     </w:p>
     <w:p>
@@ -271,7 +271,7 @@
         <w:pStyle w:val="ListBullet"/>
       </w:pPr>
       <w:r>
-        <w:t>±06:00 op met hoofdlampen: van de hut naar de top van de Mulhacén is ±2,5 km en ±430 m stijging over de westgraat (1,5 uur). Zonsopkomst op 3.479 m is het magische moment van het weekend.</w:t>
+        <w:t>Optioneel: een kort en mooi wandelingetje door de Poqueira-kloof (Capileira–Bubión–Pampaneira, ±1,5 uur licht dalend) of met de auto naar Trevélez voor jamón-proeverij.</w:t>
       </w:r>
     </w:p>
     <w:p>
@@ -279,7 +279,15 @@
         <w:pStyle w:val="ListBullet"/>
       </w:pPr>
       <w:r>
-        <w:t>Terug bij de hut ontbijten en inpakken, daarna in ±4–5 uur afdalen naar Capileira (of terug naar het mirador als de shuttle is geboekt voor de terugweg).</w:t>
+        <w:t>Late lunch, terugrit naar Málaga (±2u15). Eventueel onderweg een stop in Lanjarón of een dip in zee bij Salobreña.</w:t>
+      </w:r>
+    </w:p>
+    <w:p>
+      <w:pPr>
+        <w:pStyle w:val="Heading2"/>
+      </w:pPr>
+      <w:r>
+        <w:t>Bijzonder slapen in Capileira (het chill-gedeelte)</w:t>
       </w:r>
     </w:p>
     <w:p>
@@ -287,7 +295,23 @@
         <w:pStyle w:val="ListBullet"/>
       </w:pPr>
       <w:r>
-        <w:t>Late lunch in het dorp, terugrit naar Málaga (±2u15). Eventueel onderweg een stop in Lanjarón of een dip in zee bij Salobreña.</w:t>
+        <w:t>Boek een casa rural met privé-jacuzzi of (verwarmd) zwembad en uitzicht over de Poqueira-kloof. Op turismoalpujarra.com staat een filter 'spa-jacuzzi' met ±14 adressen in de Alpujarras; ook Booking/Airbnb (zoek op 'Capileira jacuzzi' of 'hot tub') hebben mooie opties in Capileira, Bubión en Pampaneira.</w:t>
+      </w:r>
+    </w:p>
+    <w:p>
+      <w:pPr>
+        <w:pStyle w:val="ListBullet"/>
+      </w:pPr>
+      <w:r>
+        <w:t>Alternatief met glamping-gevoel: een luxe yurt of bungalow op hoogte, bijv. bij Camping Trevélez (1.550 m, 'acampa en las estrellas') of een yurt-stay rond Lanjarón.</w:t>
+      </w:r>
+    </w:p>
+    <w:p>
+      <w:pPr>
+        <w:pStyle w:val="ListBullet"/>
+      </w:pPr>
+      <w:r>
+        <w:t>Tip: boek twee nachten hetzelfde adres — dat maakt het weekend pas echt ontspannen.</w:t>
       </w:r>
     </w:p>
     <w:p>
@@ -295,7 +319,12 @@
         <w:pStyle w:val="Heading2"/>
       </w:pPr>
       <w:r>
-        <w:t>Extra nodig voor de bivaknacht</w:t>
+        <w:t>Avontuur-upgrade: een nacht in bivakhut La Caldera (3.050 m)</w:t>
+      </w:r>
+    </w:p>
+    <w:p>
+      <w:r>
+        <w:t>Voor wie er een tandje avontuur bij wil: vervang de zaterdagnacht door een nacht in de onbemande stenen bivakhut La Caldera, aan een gletsjermeertje pal onder de Mulhacén. Zonsondergang boven een wolkenzee, koken op een brandertje en een overweldigende sterrenhemel — en zondag vóór zonsopkomst in 1,5 uur naar de top.</w:t>
       </w:r>
     </w:p>
     <w:p>
@@ -303,7 +332,7 @@
         <w:pStyle w:val="ListBullet"/>
       </w:pPr>
       <w:r>
-        <w:t>Warme slaapzak (comforttemperatuur rond 0 °C — nachten op 3.000 m zijn koud, ook eind september) en een slaapmatje.</w:t>
+        <w:t>Gratis, altijd open, 16 plekken, niet te reserveren (vol = vol; bivakkeren ernaast mag ook). Geen vergunning nodig.</w:t>
       </w:r>
     </w:p>
     <w:p>
@@ -311,7 +340,7 @@
         <w:pStyle w:val="ListBullet"/>
       </w:pPr>
       <w:r>
-        <w:t>Kooksetje + gasbrander, vrieszakmaaltijden of pasta, ontbijt en ruim snacks; 2× zoveel als je denkt nodig te hebben.</w:t>
+        <w:t>Wel nodig: warme slaapzak (comfort ±0 °C), matje, brander + eten, waterfilter (water uit de lagune). De hut is basic: stenen slaapplateaus, geen verwarming, geen toilet.</w:t>
       </w:r>
     </w:p>
     <w:p>
@@ -319,7 +348,20 @@
         <w:pStyle w:val="ListBullet"/>
       </w:pPr>
       <w:r>
-        <w:t>Waterfilter of -tabletten (water komt uit de lagune).</w:t>
+        <w:t>Alleen doen bij een stabiele weersverwachting — en de jacuzzi staat zondag alsnog klaar.</w:t>
+      </w:r>
+    </w:p>
+    <w:p>
+      <w:pPr>
+        <w:pStyle w:val="Heading2"/>
+      </w:pPr>
+      <w:r>
+        <w:t>Alternatieve berghut: Refugio Postero Alto + Picón de Jérez</w:t>
+      </w:r>
+    </w:p>
+    <w:p>
+      <w:r>
+        <w:t>Wil je tóch de klassieke bemande-berghut-ervaring (stapelbedden, warme douche, diner aan lange tafels) nu Poqueira dicht is? Refugio Postero Alto (1.880 m, 62 bedden) bij Jérez del Marquesado, aan de noordkant van de Sierra Nevada, is recent na renovatie heropend.</w:t>
       </w:r>
     </w:p>
     <w:p>
@@ -327,44 +369,7 @@
         <w:pStyle w:val="ListBullet"/>
       </w:pPr>
       <w:r>
-        <w:t>De hut is basic: stenen slaapplateaus, geen verwarming, geen toilet. Dat is precies de charme — maar wees erop voorbereid.</w:t>
-      </w:r>
-    </w:p>
-    <w:p>
-      <w:pPr>
-        <w:pStyle w:val="ListBullet"/>
-      </w:pPr>
-      <w:r>
-        <w:t>Geen bivak-ervaring of liever niet sjouwen? Kies dan de comfort-variant hieronder.</w:t>
-      </w:r>
-    </w:p>
-    <w:p>
-      <w:pPr>
-        <w:pStyle w:val="Heading2"/>
-      </w:pPr>
-      <w:r>
-        <w:t>Comfort-variant: Refugio Postero Alto + Picón de Jérez</w:t>
-      </w:r>
-    </w:p>
-    <w:p>
-      <w:r>
-        <w:t>Wil je wél de bemande-berghut-ervaring (bedden, warme douche, diner aan lange tafels) nu Poqueira dicht is? Rijd dan naar de noordkant van de Sierra Nevada: Refugio Postero Alto (1.880 m, 62 bedden) bij Jérez del Marquesado is recent na renovatie heropend.</w:t>
-      </w:r>
-    </w:p>
-    <w:p>
-      <w:pPr>
-        <w:pStyle w:val="ListBullet"/>
-      </w:pPr>
-      <w:r>
-        <w:t>Rijtijd vanaf Málaga ±2u30 via Granada/Guadix. Zaterdag: wandel vanaf Jérez del Marquesado via het PR-A 31-pad naar de hut (±1u45, rustig) of loop een langere lus; de auto kan eventueel zelfs via een 12,8 km lange bospiste tot de hut.</w:t>
-      </w:r>
-    </w:p>
-    <w:p>
-      <w:pPr>
-        <w:pStyle w:val="ListBullet"/>
-      </w:pPr>
-      <w:r>
-        <w:t>Zondag: beklimming van de Picón de Jérez (3.088 m) — een stevige maar prachtige tocht door het Alhorí-dal; jullie eerste drieduizender.</w:t>
+        <w:t>Rijtijd vanaf Málaga ±2u30 via Granada/Guadix. Zaterdag: wandel vanaf Jérez del Marquesado via het PR-A 31-pad naar de hut (±1u45, rustig); zondag de Picón de Jérez (3.088 m) door het Alhorí-dal.</w:t>
       </w:r>
     </w:p>
     <w:p>
@@ -500,7 +505,7 @@
               <w:rPr>
                 <w:b/>
               </w:rPr>
-              <w:t>Mulhacén + bivak La Caldera</w:t>
+              <w:t>Mulhacén-topdag + basecamp Capileira</w:t>
             </w:r>
           </w:p>
         </w:tc>
@@ -674,7 +679,7 @@
           </w:tcPr>
           <w:p>
             <w:r>
-              <w:t>Pittig (bivak op 3.000 m)</w:t>
+              <w:t>Gemiddeld (topdag met shuttle)</w:t>
             </w:r>
           </w:p>
         </w:tc>
@@ -719,7 +724,7 @@
               <w:rPr>
                 <w:b/>
               </w:rPr>
-              <w:t>Bijzondere overnachting</w:t>
+              <w:t>Chill-factor</w:t>
             </w:r>
           </w:p>
         </w:tc>
@@ -729,7 +734,7 @@
           </w:tcPr>
           <w:p>
             <w:r>
-              <w:t>Bivakhut aan bergmeer ★</w:t>
+              <w:t>Casa met jacuzzi ★ (optie: bivakhut)</w:t>
             </w:r>
           </w:p>
         </w:tc>
@@ -749,7 +754,7 @@
           </w:tcPr>
           <w:p>
             <w:r>
-              <w:t>Ronda / glamping Yunquera</w:t>
+              <w:t>Hotel in Ronda / glamping</w:t>
             </w:r>
           </w:p>
         </w:tc>
@@ -759,7 +764,7 @@
           </w:tcPr>
           <w:p>
             <w:r>
-              <w:t>Sterren-dome Axarquía</w:t>
+              <w:t>Sterren-dome / yurt Axarquía</w:t>
             </w:r>
           </w:p>
         </w:tc>
@@ -841,7 +846,7 @@
         <w:pStyle w:val="ListBullet"/>
       </w:pPr>
       <w:r>
-        <w:t>Aan de kust is het nog ±25–28 °C; in de bergen op 2.500 m kan het 's nachts richting 0–5 °C gaan en op de Mulhacén-top waait het vaak hard. Neem dus echt warme lagen mee, ook al vertrek je in de zon.</w:t>
+        <w:t>Aan de kust is het nog ±25–28 °C; op de Mulhacén-top kan het ook overdag rond 5–10 °C zijn en waait het vaak hard. Neem dus echt warme lagen mee, ook al vertrek je in de zon.</w:t>
       </w:r>
     </w:p>
     <w:p>
@@ -897,7 +902,7 @@
         <w:pStyle w:val="ListBullet"/>
       </w:pPr>
       <w:r>
-        <w:t>Bij de bivak-optie: warme slaapzak, matje, brander + kookset, waterfilter (zie hoofdstuk hierboven); bij Postero Alto volstaan lakenzak en oordopjes</w:t>
+        <w:t>Alleen bij de bivak-upgrade: warme slaapzak, matje, brander + kookset, waterfilter (zie hoofdstuk hierboven); bij Postero Alto volstaan lakenzak en oordopjes</w:t>
       </w:r>
     </w:p>
     <w:p>
@@ -977,7 +982,7 @@
         <w:pStyle w:val="ListNumber"/>
       </w:pPr>
       <w:r>
-        <w:t>2. Kiezen: bivak-avontuur (La Caldera, niet te reserveren) of comfort-hut (Postero Alto bellen: +34 622 762 265).</w:t>
+        <w:t>2. Casa rural met jacuzzi/zwembad in Capileira boeken voor twee nachten (turismoalpujarra.com filter 'spa-jacuzzi', of Booking/Airbnb 'hot tub') — de mooiste adressen zijn vroeg vol.</w:t>
       </w:r>
     </w:p>
     <w:p>
@@ -985,7 +990,7 @@
         <w:pStyle w:val="ListNumber"/>
       </w:pPr>
       <w:r>
-        <w:t>3. Hotel/casa rural in Capileira boeken voor de vrijdagnacht.</w:t>
+        <w:t>3. Shuttle Altas Cumbres reserveren voor de zaterdag, heen én terug (bezoekerscentrum Capileira).</w:t>
       </w:r>
     </w:p>
     <w:p>
@@ -993,7 +998,7 @@
         <w:pStyle w:val="ListNumber"/>
       </w:pPr>
       <w:r>
-        <w:t>4. Shuttle Altas Cumbres reserveren voor de zaterdag (bezoekerscentrum Capileira).</w:t>
+        <w:t>4. Restaurant voor zaterdagavond reserveren (klein dorp, beperkt aantal goede tafels).</w:t>
       </w:r>
     </w:p>
     <w:p>
@@ -1001,7 +1006,7 @@
         <w:pStyle w:val="ListNumber"/>
       </w:pPr>
       <w:r>
-        <w:t>5. Slaapzakken/matjes/brandertje regelen — meenemen uit Nederland of huren/kopen in Málaga (bijv. Decathlon).</w:t>
+        <w:t>5. Bij de bivak-upgrade: slaapzakken/matjes/brandertje regelen — meenemen of kopen bij Decathlon Málaga.</w:t>
       </w:r>
     </w:p>
     <w:p>
@@ -1009,7 +1014,7 @@
         <w:pStyle w:val="ListNumber"/>
       </w:pPr>
       <w:r>
-        <w:t>6. Vlak voor vertrek: check refugiopoqueira.com — bij heropening is dát de mooiste optie.</w:t>
+        <w:t>6. Vlak voor vertrek: check refugiopoqueira.com — bij heropening is een hutnacht op 2.500 m een mooie extra optie.</w:t>
       </w:r>
     </w:p>
     <w:p>

</xml_diff>

<commit_message>
Fix dubbele nummering in checklist van hike-plan
https://claude.ai/code/session_013vtxQxvcoD3zUXmjsxU5ik
</commit_message>
<xml_diff>
--- a/Hike-Malaga-met-Joanne-eind-september.docx
+++ b/Hike-Malaga-met-Joanne-eind-september.docx
@@ -974,7 +974,7 @@
         <w:pStyle w:val="ListNumber"/>
       </w:pPr>
       <w:r>
-        <w:t>1. Data prikken met Joanne (vrijdag t/m zondag, eind september).</w:t>
+        <w:t>Data prikken met Joanne (vrijdag t/m zondag, eind september).</w:t>
       </w:r>
     </w:p>
     <w:p>
@@ -982,7 +982,7 @@
         <w:pStyle w:val="ListNumber"/>
       </w:pPr>
       <w:r>
-        <w:t>2. Casa rural met jacuzzi/zwembad in Capileira boeken voor twee nachten (turismoalpujarra.com filter 'spa-jacuzzi', of Booking/Airbnb 'hot tub') — de mooiste adressen zijn vroeg vol.</w:t>
+        <w:t>Casa rural met jacuzzi/zwembad in Capileira boeken voor twee nachten (turismoalpujarra.com filter 'spa-jacuzzi', of Booking/Airbnb 'hot tub') — de mooiste adressen zijn vroeg vol.</w:t>
       </w:r>
     </w:p>
     <w:p>
@@ -990,7 +990,7 @@
         <w:pStyle w:val="ListNumber"/>
       </w:pPr>
       <w:r>
-        <w:t>3. Shuttle Altas Cumbres reserveren voor de zaterdag, heen én terug (bezoekerscentrum Capileira).</w:t>
+        <w:t>Shuttle Altas Cumbres reserveren voor de zaterdag, heen én terug (bezoekerscentrum Capileira).</w:t>
       </w:r>
     </w:p>
     <w:p>
@@ -998,7 +998,7 @@
         <w:pStyle w:val="ListNumber"/>
       </w:pPr>
       <w:r>
-        <w:t>4. Restaurant voor zaterdagavond reserveren (klein dorp, beperkt aantal goede tafels).</w:t>
+        <w:t>Restaurant voor zaterdagavond reserveren (klein dorp, beperkt aantal goede tafels).</w:t>
       </w:r>
     </w:p>
     <w:p>
@@ -1006,7 +1006,7 @@
         <w:pStyle w:val="ListNumber"/>
       </w:pPr>
       <w:r>
-        <w:t>5. Bij de bivak-upgrade: slaapzakken/matjes/brandertje regelen — meenemen of kopen bij Decathlon Málaga.</w:t>
+        <w:t>Bij de bivak-upgrade: slaapzakken/matjes/brandertje regelen — meenemen of kopen bij Decathlon Málaga.</w:t>
       </w:r>
     </w:p>
     <w:p>
@@ -1014,7 +1014,7 @@
         <w:pStyle w:val="ListNumber"/>
       </w:pPr>
       <w:r>
-        <w:t>6. Vlak voor vertrek: check refugiopoqueira.com — bij heropening is een hutnacht op 2.500 m een mooie extra optie.</w:t>
+        <w:t>Vlak voor vertrek: check refugiopoqueira.com — bij heropening is een hutnacht op 2.500 m een mooie extra optie.</w:t>
       </w:r>
     </w:p>
     <w:p>
@@ -1022,7 +1022,7 @@
         <w:pStyle w:val="ListNumber"/>
       </w:pPr>
       <w:r>
-        <w:t>7. Week vooraf: weersverwachting checken en paklijst klaarleggen.</w:t>
+        <w:t>Week vooraf: weersverwachting checken en paklijst klaarleggen.</w:t>
       </w:r>
     </w:p>
     <w:p>

</xml_diff>